<commit_message>
Fix UTF-8 mojibake encoding for product import and auto-clean corrupted category names
</commit_message>
<xml_diff>
--- a/MANUAL_USUARIO_PROTOSTOCK.docx
+++ b/MANUAL_USUARIO_PROTOSTOCK.docx
@@ -204,7 +204,421 @@
           <w:color w:val="E11D48"/>
           <w:sz w:val="32"/>
         </w:rPr>
-        <w:t>3. Módulo POS: Punto de Venta &amp; Cobro</w:t>
+        <w:t>3. Flujo de Trabajo del Administrador (Admin User Flow)</w:t>
+      </w:r>
+    </w:p>
+    <w:p>
+      <w:r>
+        <w:rPr>
+          <w:sz w:val="22"/>
+        </w:rPr>
+        <w:t>A continuación se describe el paso a paso secuencial que realiza el Administrador en su jornada diaria de gestión:</w:t>
+      </w:r>
+    </w:p>
+    <w:p>
+      <w:pPr>
+        <w:spacing w:before="240" w:after="80"/>
+      </w:pPr>
+      <w:r>
+        <w:rPr>
+          <w:rFonts w:ascii="Calibri" w:hAnsi="Calibri"/>
+          <w:b/>
+          <w:color w:val="0F172A"/>
+          <w:sz w:val="26"/>
+        </w:rPr>
+        <w:t>Paso 1: Inicio de Sesión &amp; Autenticación</w:t>
+      </w:r>
+    </w:p>
+    <w:p>
+      <w:pPr>
+        <w:pStyle w:val="ListBullet"/>
+        <w:spacing w:after="60"/>
+      </w:pPr>
+      <w:r>
+        <w:rPr>
+          <w:rFonts w:ascii="Calibri" w:hAnsi="Calibri"/>
+          <w:b/>
+          <w:sz w:val="22"/>
+        </w:rPr>
+        <w:t xml:space="preserve">Ingreso: </w:t>
+      </w:r>
+      <w:r>
+        <w:rPr>
+          <w:rFonts w:ascii="Calibri" w:hAnsi="Calibri"/>
+          <w:sz w:val="22"/>
+        </w:rPr>
+        <w:t>Accede a la pantalla de Login (/login) y selecciona la cuenta @admin con su contraseña o PIN.</w:t>
+      </w:r>
+    </w:p>
+    <w:p>
+      <w:pPr>
+        <w:pStyle w:val="ListBullet"/>
+        <w:spacing w:after="60"/>
+      </w:pPr>
+      <w:r>
+        <w:rPr>
+          <w:rFonts w:ascii="Calibri" w:hAnsi="Calibri"/>
+          <w:b/>
+          <w:sz w:val="22"/>
+        </w:rPr>
+        <w:t xml:space="preserve">Redirección: </w:t>
+      </w:r>
+      <w:r>
+        <w:rPr>
+          <w:rFonts w:ascii="Calibri" w:hAnsi="Calibri"/>
+          <w:sz w:val="22"/>
+        </w:rPr>
+        <w:t>El sistema verifica las credenciales y lo redirige automáticamente al Dashboard principal.</w:t>
+      </w:r>
+    </w:p>
+    <w:p>
+      <w:pPr>
+        <w:spacing w:before="240" w:after="80"/>
+      </w:pPr>
+      <w:r>
+        <w:rPr>
+          <w:rFonts w:ascii="Calibri" w:hAnsi="Calibri"/>
+          <w:b/>
+          <w:color w:val="0F172A"/>
+          <w:sz w:val="26"/>
+        </w:rPr>
+        <w:t>Paso 2: Revisión del Estado General (Dashboard)</w:t>
+      </w:r>
+    </w:p>
+    <w:p>
+      <w:pPr>
+        <w:pStyle w:val="ListBullet"/>
+        <w:spacing w:after="60"/>
+      </w:pPr>
+      <w:r>
+        <w:rPr>
+          <w:rFonts w:ascii="Calibri" w:hAnsi="Calibri"/>
+          <w:b/>
+          <w:sz w:val="22"/>
+        </w:rPr>
+        <w:t xml:space="preserve">Lectura de Métricas: </w:t>
+      </w:r>
+      <w:r>
+        <w:rPr>
+          <w:rFonts w:ascii="Calibri" w:hAnsi="Calibri"/>
+          <w:sz w:val="22"/>
+        </w:rPr>
+        <w:t>Visualiza el total facturado del día, los productos en nivel crítico de stock y los lotes próximos a vencer.</w:t>
+      </w:r>
+    </w:p>
+    <w:p>
+      <w:pPr>
+        <w:spacing w:before="240" w:after="80"/>
+      </w:pPr>
+      <w:r>
+        <w:rPr>
+          <w:rFonts w:ascii="Calibri" w:hAnsi="Calibri"/>
+          <w:b/>
+          <w:color w:val="0F172A"/>
+          <w:sz w:val="26"/>
+        </w:rPr>
+        <w:t>Paso 3: Apertura de Turno de Caja</w:t>
+      </w:r>
+    </w:p>
+    <w:p>
+      <w:pPr>
+        <w:pStyle w:val="ListBullet"/>
+        <w:spacing w:after="60"/>
+      </w:pPr>
+      <w:r>
+        <w:rPr>
+          <w:rFonts w:ascii="Calibri" w:hAnsi="Calibri"/>
+          <w:b/>
+          <w:sz w:val="22"/>
+        </w:rPr>
+        <w:t xml:space="preserve">Apertura: </w:t>
+      </w:r>
+      <w:r>
+        <w:rPr>
+          <w:rFonts w:ascii="Calibri" w:hAnsi="Calibri"/>
+          <w:sz w:val="22"/>
+        </w:rPr>
+        <w:t>Ingresa a Turnos &amp; Caja (/caja) para iniciar el turno indicando el monto en efectivo de cambio inicial (ej: $10.000).</w:t>
+      </w:r>
+    </w:p>
+    <w:p>
+      <w:pPr>
+        <w:spacing w:before="240" w:after="80"/>
+      </w:pPr>
+      <w:r>
+        <w:rPr>
+          <w:rFonts w:ascii="Calibri" w:hAnsi="Calibri"/>
+          <w:b/>
+          <w:color w:val="0F172A"/>
+          <w:sz w:val="26"/>
+        </w:rPr>
+        <w:t>Paso 4: Operación en Mostrador (POS)</w:t>
+      </w:r>
+    </w:p>
+    <w:p>
+      <w:pPr>
+        <w:pStyle w:val="ListBullet"/>
+        <w:spacing w:after="60"/>
+      </w:pPr>
+      <w:r>
+        <w:rPr>
+          <w:rFonts w:ascii="Calibri" w:hAnsi="Calibri"/>
+          <w:b/>
+          <w:sz w:val="22"/>
+        </w:rPr>
+        <w:t xml:space="preserve">Modo Tablet: </w:t>
+      </w:r>
+      <w:r>
+        <w:rPr>
+          <w:rFonts w:ascii="Calibri" w:hAnsi="Calibri"/>
+          <w:sz w:val="22"/>
+        </w:rPr>
+        <w:t>En caso de operar desde una tablet, activa el 'Modo Tablet: Teclado Virtual OFF'.</w:t>
+      </w:r>
+    </w:p>
+    <w:p>
+      <w:pPr>
+        <w:pStyle w:val="ListBullet"/>
+        <w:spacing w:after="60"/>
+      </w:pPr>
+      <w:r>
+        <w:rPr>
+          <w:rFonts w:ascii="Calibri" w:hAnsi="Calibri"/>
+          <w:b/>
+          <w:sz w:val="22"/>
+        </w:rPr>
+        <w:t xml:space="preserve">Escaneo y Pesaje: </w:t>
+      </w:r>
+      <w:r>
+        <w:rPr>
+          <w:rFonts w:ascii="Calibri" w:hAnsi="Calibri"/>
+          <w:sz w:val="22"/>
+        </w:rPr>
+        <w:t>Escanea los productos con lector de barras o selecciona fiambres por gramos (100g, 250g, 500g).</w:t>
+      </w:r>
+    </w:p>
+    <w:p>
+      <w:pPr>
+        <w:pStyle w:val="ListBullet"/>
+        <w:spacing w:after="60"/>
+      </w:pPr>
+      <w:r>
+        <w:rPr>
+          <w:rFonts w:ascii="Calibri" w:hAnsi="Calibri"/>
+          <w:b/>
+          <w:sz w:val="22"/>
+        </w:rPr>
+        <w:t xml:space="preserve">Cobro e Impresión: </w:t>
+      </w:r>
+      <w:r>
+        <w:rPr>
+          <w:rFonts w:ascii="Calibri" w:hAnsi="Calibri"/>
+          <w:sz w:val="22"/>
+        </w:rPr>
+        <w:t>Selecciona el método de pago (Efectivo, Débito, Crédito, Mercado Pago), calcula el vuelto con billetes rápidos e imprime el Ticket Térmico.</w:t>
+      </w:r>
+    </w:p>
+    <w:p>
+      <w:pPr>
+        <w:spacing w:before="240" w:after="80"/>
+      </w:pPr>
+      <w:r>
+        <w:rPr>
+          <w:rFonts w:ascii="Calibri" w:hAnsi="Calibri"/>
+          <w:b/>
+          <w:color w:val="0F172A"/>
+          <w:sz w:val="26"/>
+        </w:rPr>
+        <w:t>Paso 5: Gestión de Inventario, Precios y Lotes</w:t>
+      </w:r>
+    </w:p>
+    <w:p>
+      <w:pPr>
+        <w:pStyle w:val="ListBullet"/>
+        <w:spacing w:after="60"/>
+      </w:pPr>
+      <w:r>
+        <w:rPr>
+          <w:rFonts w:ascii="Calibri" w:hAnsi="Calibri"/>
+          <w:b/>
+          <w:sz w:val="22"/>
+        </w:rPr>
+        <w:t xml:space="preserve">Actualización de Precios: </w:t>
+      </w:r>
+      <w:r>
+        <w:rPr>
+          <w:rFonts w:ascii="Calibri" w:hAnsi="Calibri"/>
+          <w:sz w:val="22"/>
+        </w:rPr>
+        <w:t>Desde Productos &amp; Precios (/productos), modifica precios de lista o importa nuevos catálogos desde Excel.</w:t>
+      </w:r>
+    </w:p>
+    <w:p>
+      <w:pPr>
+        <w:pStyle w:val="ListBullet"/>
+        <w:spacing w:after="60"/>
+      </w:pPr>
+      <w:r>
+        <w:rPr>
+          <w:rFonts w:ascii="Calibri" w:hAnsi="Calibri"/>
+          <w:b/>
+          <w:sz w:val="22"/>
+        </w:rPr>
+        <w:t xml:space="preserve">Carga de Compras: </w:t>
+      </w:r>
+      <w:r>
+        <w:rPr>
+          <w:rFonts w:ascii="Calibri" w:hAnsi="Calibri"/>
+          <w:sz w:val="22"/>
+        </w:rPr>
+        <w:t>Desde Compras &amp; Lotes (/compras), registra nuevos lotes de mercadería ingresando proveedor y fecha de expiración.</w:t>
+      </w:r>
+    </w:p>
+    <w:p>
+      <w:pPr>
+        <w:pStyle w:val="ListBullet"/>
+        <w:spacing w:after="60"/>
+      </w:pPr>
+      <w:r>
+        <w:rPr>
+          <w:rFonts w:ascii="Calibri" w:hAnsi="Calibri"/>
+          <w:b/>
+          <w:sz w:val="22"/>
+        </w:rPr>
+        <w:t xml:space="preserve">Bajas de Stock: </w:t>
+      </w:r>
+      <w:r>
+        <w:rPr>
+          <w:rFonts w:ascii="Calibri" w:hAnsi="Calibri"/>
+          <w:sz w:val="22"/>
+        </w:rPr>
+        <w:t>Registra mermas o productos vencidos descontándolos de la base de datos.</w:t>
+      </w:r>
+    </w:p>
+    <w:p>
+      <w:pPr>
+        <w:spacing w:before="240" w:after="80"/>
+      </w:pPr>
+      <w:r>
+        <w:rPr>
+          <w:rFonts w:ascii="Calibri" w:hAnsi="Calibri"/>
+          <w:b/>
+          <w:color w:val="0F172A"/>
+          <w:sz w:val="26"/>
+        </w:rPr>
+        <w:t>Paso 6: Auditoría de Seguridad &amp; Gestión de Personal</w:t>
+      </w:r>
+    </w:p>
+    <w:p>
+      <w:pPr>
+        <w:pStyle w:val="ListBullet"/>
+        <w:spacing w:after="60"/>
+      </w:pPr>
+      <w:r>
+        <w:rPr>
+          <w:rFonts w:ascii="Calibri" w:hAnsi="Calibri"/>
+          <w:b/>
+          <w:sz w:val="22"/>
+        </w:rPr>
+        <w:t xml:space="preserve">Usuarios y Claves: </w:t>
+      </w:r>
+      <w:r>
+        <w:rPr>
+          <w:rFonts w:ascii="Calibri" w:hAnsi="Calibri"/>
+          <w:sz w:val="22"/>
+        </w:rPr>
+        <w:t>Desde Usuarios &amp; Permisos (/usuarios), crea nuevos usuarios o modifica las contraseñas/PIN de cajeros y encargados.</w:t>
+      </w:r>
+    </w:p>
+    <w:p>
+      <w:pPr>
+        <w:pStyle w:val="ListBullet"/>
+        <w:spacing w:after="60"/>
+      </w:pPr>
+      <w:r>
+        <w:rPr>
+          <w:rFonts w:ascii="Calibri" w:hAnsi="Calibri"/>
+          <w:b/>
+          <w:sz w:val="22"/>
+        </w:rPr>
+        <w:t xml:space="preserve">Auditoría de Retiros: </w:t>
+      </w:r>
+      <w:r>
+        <w:rPr>
+          <w:rFonts w:ascii="Calibri" w:hAnsi="Calibri"/>
+          <w:sz w:val="22"/>
+        </w:rPr>
+        <w:t>Supervisa las salidas de efectivo registradas por empleados para pago a proveedores.</w:t>
+      </w:r>
+    </w:p>
+    <w:p>
+      <w:pPr>
+        <w:spacing w:before="240" w:after="80"/>
+      </w:pPr>
+      <w:r>
+        <w:rPr>
+          <w:rFonts w:ascii="Calibri" w:hAnsi="Calibri"/>
+          <w:b/>
+          <w:color w:val="0F172A"/>
+          <w:sz w:val="26"/>
+        </w:rPr>
+        <w:t>Paso 7: Cierre de Jornada &amp; Análisis de Reportes</w:t>
+      </w:r>
+    </w:p>
+    <w:p>
+      <w:pPr>
+        <w:pStyle w:val="ListBullet"/>
+        <w:spacing w:after="60"/>
+      </w:pPr>
+      <w:r>
+        <w:rPr>
+          <w:rFonts w:ascii="Calibri" w:hAnsi="Calibri"/>
+          <w:b/>
+          <w:sz w:val="22"/>
+        </w:rPr>
+        <w:t xml:space="preserve">Arqueo Final: </w:t>
+      </w:r>
+      <w:r>
+        <w:rPr>
+          <w:rFonts w:ascii="Calibri" w:hAnsi="Calibri"/>
+          <w:sz w:val="22"/>
+        </w:rPr>
+        <w:t>Ingresa a Turnos &amp; Caja (/caja), realiza el recuento físico de billetes y cierra el turno registrando si hubo sobrante o faltante.</w:t>
+      </w:r>
+    </w:p>
+    <w:p>
+      <w:pPr>
+        <w:pStyle w:val="ListBullet"/>
+        <w:spacing w:after="60"/>
+      </w:pPr>
+      <w:r>
+        <w:rPr>
+          <w:rFonts w:ascii="Calibri" w:hAnsi="Calibri"/>
+          <w:b/>
+          <w:sz w:val="22"/>
+        </w:rPr>
+        <w:t xml:space="preserve">Reportes de Ganancia: </w:t>
+      </w:r>
+      <w:r>
+        <w:rPr>
+          <w:rFonts w:ascii="Calibri" w:hAnsi="Calibri"/>
+          <w:sz w:val="22"/>
+        </w:rPr>
+        <w:t>En Reportes &amp; Métricas (/reportes), analiza la ganancia bruta acumulada y el desglose de ingresos por método de pago.</w:t>
+      </w:r>
+    </w:p>
+    <w:p>
+      <w:pPr>
+        <w:spacing w:before="320" w:after="120"/>
+      </w:pPr>
+      <w:r>
+        <w:rPr>
+          <w:rFonts w:ascii="Calibri" w:hAnsi="Calibri"/>
+          <w:b/>
+          <w:color w:val="E11D48"/>
+          <w:sz w:val="32"/>
+        </w:rPr>
+        <w:t>4. Módulo POS: Punto de Venta &amp; Cobro</w:t>
       </w:r>
     </w:p>
     <w:p>
@@ -302,7 +716,7 @@
           <w:color w:val="E11D48"/>
           <w:sz w:val="32"/>
         </w:rPr>
-        <w:t>4. Módulo Impresión de Ticket Térmico</w:t>
+        <w:t>5. Módulo Impresión de Ticket Térmico</w:t>
       </w:r>
     </w:p>
     <w:p>
@@ -379,7 +793,7 @@
           <w:color w:val="E11D48"/>
           <w:sz w:val="32"/>
         </w:rPr>
-        <w:t>5. Productos, Precios &amp; Importación desde Excel</w:t>
+        <w:t>6. Productos, Precios &amp; Importación desde Excel</w:t>
       </w:r>
     </w:p>
     <w:p>
@@ -456,7 +870,7 @@
           <w:color w:val="E11D48"/>
           <w:sz w:val="32"/>
         </w:rPr>
-        <w:t>6. Turnos &amp; Caja Diaria</w:t>
+        <w:t>7. Turnos &amp; Caja Diaria</w:t>
       </w:r>
     </w:p>
     <w:p>
@@ -533,7 +947,7 @@
           <w:color w:val="E11D48"/>
           <w:sz w:val="32"/>
         </w:rPr>
-        <w:t>7. Compras, Lotes &amp; Proveedores Frecuentes</w:t>
+        <w:t>8. Compras, Lotes &amp; Proveedores Frecuentes</w:t>
       </w:r>
     </w:p>
     <w:p>
@@ -589,7 +1003,7 @@
           <w:color w:val="E11D48"/>
           <w:sz w:val="32"/>
         </w:rPr>
-        <w:t>8. Reportes &amp; Métricas de Ganancia</w:t>
+        <w:t>9. Reportes &amp; Métricas de Ganancia</w:t>
       </w:r>
     </w:p>
     <w:p>
@@ -645,7 +1059,7 @@
           <w:color w:val="E11D48"/>
           <w:sz w:val="32"/>
         </w:rPr>
-        <w:t>9. Centro de Notificaciones Inteligentes por Rol</w:t>
+        <w:t>10. Centro de Notificaciones Inteligentes por Rol</w:t>
       </w:r>
     </w:p>
     <w:p>

</xml_diff>